<commit_message>
docs: fuenf Aufgabengebiete in die Chef-Uebersicht aufnehmen
Ingos Rollenbeschreibung (ABAP-Entwicklung S/4HANA, Data-Warehouse-Architektur,
gruppenweites Power-BI-Reporting, HR-KPI-Dashboard, Innovation) wird als neuer
Abschnitt 2 aufgenommen; die uebrigen Abschnitte ruecken auf 3 bis 11.

Text in erste Person gebracht, weil das Dokument aus Ingos Sicht geschrieben ist.
Jedes Gebiet endet mit den Arbeitspaketen, die derzeit daraus laufen, damit die
dauerhafte Rolle vom Tagesstand getrennt bleibt und trotzdem auffindbar ist.

Widerspruch aufgeloest statt uebergangen: die ABAP-Entwicklung liegt bei Ingo,
der S/4HANA-Compatibility-Check und die RFC-Abschaltungen liegen bei Lucas. Die
Nicht-Zustaendigkeitstabelle sagt das jetzt woertlich und verweist auf 2.1.

Co-Authored-By: Claude Opus 5 (1M context) <noreply@anthropic.com>
Claude-Session: https://claude.ai/code/session_01FEipEUVZc9ato4KCZ6FN4R
</commit_message>
<xml_diff>
--- a/TrafagSalesExporter/docs/Uebersicht_Aufgaben_Ingo_2026-09-02.docx
+++ b/TrafagSalesExporter/docs/Uebersicht_Aufgaben_Ingo_2026-09-02.docx
@@ -70,7 +70,7 @@
         <w:spacing w:after="60" w:line="288" w:lineRule="auto"/>
       </w:pPr>
       <w:r>
-        <w:t xml:space="preserve">2. Was in meiner Verantwortung liegt und was nicht</w:t>
+        <w:t xml:space="preserve">2. Meine fünf Aufgabengebiete</w:t>
       </w:r>
     </w:p>
     <w:p>
@@ -83,7 +83,7 @@
         <w:spacing w:after="60" w:line="288" w:lineRule="auto"/>
       </w:pPr>
       <w:r>
-        <w:t xml:space="preserve">3. Der einzige harte Termin: 08.09.2026</w:t>
+        <w:t xml:space="preserve">3. Was in meiner Verantwortung liegt und was nicht</w:t>
       </w:r>
     </w:p>
     <w:p>
@@ -96,7 +96,7 @@
         <w:spacing w:after="60" w:line="288" w:lineRule="auto"/>
       </w:pPr>
       <w:r>
-        <w:t xml:space="preserve">4. Wo ich einen Entscheid oder eine Zulieferung brauche</w:t>
+        <w:t xml:space="preserve">4. Der einzige harte Termin: 08.09.2026</w:t>
       </w:r>
     </w:p>
     <w:p>
@@ -109,7 +109,7 @@
         <w:spacing w:after="60" w:line="288" w:lineRule="auto"/>
       </w:pPr>
       <w:r>
-        <w:t xml:space="preserve">5. Die acht Arbeitspakete im Einzelnen</w:t>
+        <w:t xml:space="preserve">5. Wo ich einen Entscheid oder eine Zulieferung brauche</w:t>
       </w:r>
     </w:p>
     <w:p>
@@ -122,7 +122,7 @@
         <w:spacing w:after="60" w:line="288" w:lineRule="auto"/>
       </w:pPr>
       <w:r>
-        <w:t xml:space="preserve">6. Was in den nächsten sechs Monaten fertig wird</w:t>
+        <w:t xml:space="preserve">6. Die acht Arbeitspakete im Einzelnen</w:t>
       </w:r>
     </w:p>
     <w:p>
@@ -135,7 +135,7 @@
         <w:spacing w:after="60" w:line="288" w:lineRule="auto"/>
       </w:pPr>
       <w:r>
-        <w:t xml:space="preserve">7. Datenqualität und Nachweisführung</w:t>
+        <w:t xml:space="preserve">7. Was in den nächsten sechs Monaten fertig wird</w:t>
       </w:r>
     </w:p>
     <w:p>
@@ -148,7 +148,7 @@
         <w:spacing w:after="60" w:line="288" w:lineRule="auto"/>
       </w:pPr>
       <w:r>
-        <w:t xml:space="preserve">8. Know-how-Risiko und Wiederanlauf</w:t>
+        <w:t xml:space="preserve">8. Datenqualität und Nachweisführung</w:t>
       </w:r>
     </w:p>
     <w:p>
@@ -161,7 +161,7 @@
         <w:spacing w:after="60" w:line="288" w:lineRule="auto"/>
       </w:pPr>
       <w:r>
-        <w:t xml:space="preserve">9. Personen, mit denen ich zusammenarbeite</w:t>
+        <w:t xml:space="preserve">9. Know-how-Risiko und Wiederanlauf</w:t>
       </w:r>
     </w:p>
     <w:p>
@@ -174,7 +174,20 @@
         <w:spacing w:after="60" w:line="288" w:lineRule="auto"/>
       </w:pPr>
       <w:r>
-        <w:t xml:space="preserve">10. Vorschlag für die Zusammenarbeit</w:t>
+        <w:t xml:space="preserve">10. Personen, mit denen ich zusammenarbeite</w:t>
+      </w:r>
+    </w:p>
+    <w:p>
+      <w:pPr>
+        <w:pStyle w:val="BodyText"/>
+        <w:numPr>
+          <w:ilvl w:val="0"/>
+          <w:numId w:val="1"/>
+        </w:numPr>
+        <w:spacing w:after="60" w:line="288" w:lineRule="auto"/>
+      </w:pPr>
+      <w:r>
+        <w:t xml:space="preserve">11. Vorschlag für die Zusammenarbeit</w:t>
       </w:r>
     </w:p>
     <w:p>
@@ -202,6 +215,15 @@
       <w:r>
         <w:rPr/>
         <w:t xml:space="preserve">Dazu kommen die Auswertungen für Personal und für den Einkauf sowie die Pflege der SAP-Auswertungsprogramme, soweit sie für das Reporting gebraucht werden. Der Betrieb der Auswertungsplattform, ihre Weiterentwicklung und die Sicherstellung der Datenqualität gehören ebenfalls dazu.</w:t>
+      </w:r>
+    </w:p>
+    <w:p>
+      <w:pPr>
+        <w:pStyle w:val="BodyText"/>
+      </w:pPr>
+      <w:r>
+        <w:rPr/>
+        <w:t xml:space="preserve">Der zweite Teil meiner Arbeit liegt im SAP-System selbst. Ich entwickle und pflege die kundeneigenen ABAP-Programme, mit denen Trafag Auswertungen und Abläufe abbildet, die der Standard nicht hergibt. Abschnitt 2 beschreibt diese fünf dauerhaften Aufgabengebiete im Einzelnen.</w:t>
       </w:r>
     </w:p>
     <w:p>
@@ -271,7 +293,7 @@
             </w:pPr>
             <w:r>
               <w:rPr/>
-              <w:t xml:space="preserve">Analytics, BI-Dashboards, Reporting-Auswertungen und die .NET-Auswertungswebseite</w:t>
+              <w:t xml:space="preserve">Fünf Gebiete: ABAP-Entwicklung in S/4HANA, Data-Warehouse-Architektur, Konzernreporting, Personalkennzahlen, Innovation</w:t>
             </w:r>
           </w:p>
         </w:tc>
@@ -524,7 +546,254 @@
       </w:pPr>
       <w:r>
         <w:rPr/>
-        <w:t xml:space="preserve">2. Was in meiner Verantwortung liegt und was nicht</w:t>
+        <w:t xml:space="preserve">2. Meine fünf Aufgabengebiete</w:t>
+      </w:r>
+    </w:p>
+    <w:p>
+      <w:pPr>
+        <w:pStyle w:val="BodyText"/>
+      </w:pPr>
+      <w:r>
+        <w:rPr/>
+        <w:t xml:space="preserve">Diese fünf Gebiete beschreiben die Rolle und gelten dauerhaft. Sie sind nicht zu verwechseln mit dem aktuellen Stand der Arbeit, der in Abschnitt 6 steht. Damit beides zusammenfindet, nennt jedes Gebiet am Ende die Arbeitspakete, die derzeit daraus laufen.</w:t>
+      </w:r>
+    </w:p>
+    <w:p>
+      <w:pPr>
+        <w:pStyle w:val="Heading2"/>
+      </w:pPr>
+      <w:r>
+        <w:rPr/>
+        <w:t xml:space="preserve">2.1 SAP S/4HANA: Entwicklung und Betreuung (ABAP)</w:t>
+      </w:r>
+    </w:p>
+    <w:p>
+      <w:pPr>
+        <w:pStyle w:val="BodyText"/>
+      </w:pPr>
+      <w:r>
+        <w:rPr/>
+        <w:t xml:space="preserve">Ich konzipiere, entwickle und warte eigenständig die kundeneigenen ABAP-Programme und Schnittstellen im S/4HANA-Umfeld. Die Schwerpunkte liegen in der Logistik, im Vertrieb, in der Variantenkonfiguration, bei den Ursprungsland- und Zollthemen sowie in der Preisfindung.</w:t>
+      </w:r>
+    </w:p>
+    <w:p>
+      <w:pPr>
+        <w:pStyle w:val="BodyText"/>
+      </w:pPr>
+      <w:r>
+        <w:rPr/>
+        <w:t xml:space="preserve">Ein eigener Schwerpunkt sind komplexe Auswertungen der mehrstufigen Stücklistenauflösung, sowohl von der Baugruppe nach unten als auch vom Einzelteil nach oben. Dazu gehören die Vererbung der Sortimentscodes über Core-, OEM- und Extended-Sortimente sowie die Vererbung der Lebenszykluscodes. Weil solche Auflösungen sehr rechenintensiv sind, werden die Ergebnisse für das nachgelagerte Reporting materialisiert, also einmal berechnet und abgelegt, statt bei jedem Aufruf neu ermittelt.</w:t>
+      </w:r>
+    </w:p>
+    <w:p>
+      <w:pPr>
+        <w:pStyle w:val="BodyText"/>
+      </w:pPr>
+      <w:r>
+        <w:rPr/>
+        <w:t xml:space="preserve">Dazu kommen Laufzeitoptimierungen, systematische Datenbereinigungen und die enge fachliche Zusammenarbeit mit externen Partnern wie NTT Data.</w:t>
+      </w:r>
+    </w:p>
+    <w:p>
+      <w:pPr>
+        <w:pStyle w:val="BodyText"/>
+        <w:pBdr>
+          <w:left w:val="single" w:color="B4C6E7" w:sz="12" w:space="8"/>
+        </w:pBdr>
+        <w:spacing w:before="60" w:after="200" w:line="288" w:lineRule="auto"/>
+        <w:ind w:left="220"/>
+      </w:pPr>
+      <w:r>
+        <w:rPr>
+          <w:i/>
+          <w:color w:val="365F91"/>
+        </w:rPr>
+        <w:t xml:space="preserve">Aktuell aus diesem Gebiet in Arbeit: PM-01, PM-02 und PM-03, siehe Abschnitt 6.</w:t>
+      </w:r>
+    </w:p>
+    <w:p>
+      <w:pPr>
+        <w:pStyle w:val="Heading2"/>
+      </w:pPr>
+      <w:r>
+        <w:rPr/>
+        <w:t xml:space="preserve">2.2 Aufbau und Architektur des Data-Warehouse-Dashboards</w:t>
+      </w:r>
+    </w:p>
+    <w:p>
+      <w:pPr>
+        <w:pStyle w:val="BodyText"/>
+      </w:pPr>
+      <w:r>
+        <w:rPr/>
+        <w:t xml:space="preserve">Ich habe die gruppenweite Data-Warehouse-Architektur als zentrale Datenplattform für das Konzernreporting konzipiert und realisiert. Dazu gehören die SAP-seitigen Extraktoren und Exportprogramme, die die operativen Daten strukturiert und wiederholbar in die Plattform überführen.</w:t>
+      </w:r>
+    </w:p>
+    <w:p>
+      <w:pPr>
+        <w:pStyle w:val="BodyText"/>
+      </w:pPr>
+      <w:r>
+        <w:rPr/>
+        <w:t xml:space="preserve">Wiederholbar heisst, dass derselbe Lauf am nächsten Tag dasselbe Ergebnis liefert und jede Zahl bis auf ihren Ursprungsbeleg zurückverfolgbar bleibt. Auf dieser Plattform setzen alle weiteren Auswertungen auf, das Verkaufsreporting ebenso wie die Auswertungen für Einkauf und Personal.</w:t>
+      </w:r>
+    </w:p>
+    <w:p>
+      <w:pPr>
+        <w:pStyle w:val="BodyText"/>
+        <w:pBdr>
+          <w:left w:val="single" w:color="B4C6E7" w:sz="12" w:space="8"/>
+        </w:pBdr>
+        <w:spacing w:before="60" w:after="200" w:line="288" w:lineRule="auto"/>
+        <w:ind w:left="220"/>
+      </w:pPr>
+      <w:r>
+        <w:rPr>
+          <w:i/>
+          <w:color w:val="365F91"/>
+        </w:rPr>
+        <w:t xml:space="preserve">Aktuell aus diesem Gebiet in Arbeit: PM-05 und PM-04, siehe Abschnitt 6.</w:t>
+      </w:r>
+    </w:p>
+    <w:p>
+      <w:pPr>
+        <w:pStyle w:val="Heading2"/>
+      </w:pPr>
+      <w:r>
+        <w:rPr/>
+        <w:t xml:space="preserve">2.3 Gruppenweites Power-BI-Reporting über alle Tochtergesellschaften</w:t>
+      </w:r>
+    </w:p>
+    <w:p>
+      <w:pPr>
+        <w:pStyle w:val="BodyText"/>
+      </w:pPr>
+      <w:r>
+        <w:rPr/>
+        <w:t xml:space="preserve">Ich habe das konzernweite Umsatzreporting über sämtliche internationalen Tochtergesellschaften aufgebaut. Dazu gehörten die Anbindung der sehr unterschiedlichen ERP-Systeme, namentlich SAP S/4HANA, SAP Business One, Sage 200 und Alphaplan, die Umsetzung der Intercompany-Abgrenzungslogik sowie die Umsatzabstimmung je Land.</w:t>
+      </w:r>
+    </w:p>
+    <w:p>
+      <w:pPr>
+        <w:pStyle w:val="BodyText"/>
+      </w:pPr>
+      <w:r>
+        <w:rPr/>
+        <w:t xml:space="preserve">Intercompany-Abgrenzung bedeutet, Verkäufe an Konzerngesellschaften von Verkäufen an Dritte zu trennen, damit derselbe Umsatz in der Gruppensicht nicht zweimal gezählt wird. Die fachlichen Anforderungen stimme ich direkt mit den Ansprechpartnern der Tochtergesellschaften ab, unter anderem in Spanien und Italien.</w:t>
+      </w:r>
+    </w:p>
+    <w:p>
+      <w:pPr>
+        <w:pStyle w:val="BodyText"/>
+        <w:pBdr>
+          <w:left w:val="single" w:color="B4C6E7" w:sz="12" w:space="8"/>
+        </w:pBdr>
+        <w:spacing w:before="60" w:after="200" w:line="288" w:lineRule="auto"/>
+        <w:ind w:left="220"/>
+      </w:pPr>
+      <w:r>
+        <w:rPr>
+          <w:i/>
+          <w:color w:val="365F91"/>
+        </w:rPr>
+        <w:t xml:space="preserve">Aktuell aus diesem Gebiet in Arbeit: PM-05 und PM-08, siehe Abschnitt 6.</w:t>
+      </w:r>
+    </w:p>
+    <w:p>
+      <w:pPr>
+        <w:pStyle w:val="Heading2"/>
+      </w:pPr>
+      <w:r>
+        <w:rPr/>
+        <w:t xml:space="preserve">2.4 HR-Kennzahlen-Dashboard und bereichsübergreifende Projekte</w:t>
+      </w:r>
+    </w:p>
+    <w:p>
+      <w:pPr>
+        <w:pStyle w:val="BodyText"/>
+      </w:pPr>
+      <w:r>
+        <w:rPr/>
+        <w:t xml:space="preserve">In enger Zusammenarbeit mit dem Personalbereich habe ich das HR-Kennzahlen-Dashboard entwickelt, mit Datenintegration aus Rexx und SAP-HR, umgesetzt über Power Query und DAX im Corporate Design von Trafag.</w:t>
+      </w:r>
+    </w:p>
+    <w:p>
+      <w:pPr>
+        <w:pStyle w:val="BodyText"/>
+      </w:pPr>
+      <w:r>
+        <w:rPr/>
+        <w:t xml:space="preserve">Das Projekt steht beispielhaft für bereichsübergreifende Vorhaben, die ich eigenständig von der Anforderungsaufnahme bis zur Auslieferung führe.</w:t>
+      </w:r>
+    </w:p>
+    <w:p>
+      <w:pPr>
+        <w:pStyle w:val="BodyText"/>
+        <w:pBdr>
+          <w:left w:val="single" w:color="B4C6E7" w:sz="12" w:space="8"/>
+        </w:pBdr>
+        <w:spacing w:before="60" w:after="200" w:line="288" w:lineRule="auto"/>
+        <w:ind w:left="220"/>
+      </w:pPr>
+      <w:r>
+        <w:rPr>
+          <w:i/>
+          <w:color w:val="365F91"/>
+        </w:rPr>
+        <w:t xml:space="preserve">Aktuell aus diesem Gebiet in Arbeit: PM-07, siehe Abschnitt 6.</w:t>
+      </w:r>
+    </w:p>
+    <w:p>
+      <w:pPr>
+        <w:pStyle w:val="Heading2"/>
+      </w:pPr>
+      <w:r>
+        <w:rPr/>
+        <w:t xml:space="preserve">2.5 Innovation und Modernisierung</w:t>
+      </w:r>
+    </w:p>
+    <w:p>
+      <w:pPr>
+        <w:pStyle w:val="BodyText"/>
+      </w:pPr>
+      <w:r>
+        <w:rPr/>
+        <w:t xml:space="preserve">Ich treibe die Einführung und Nutzung moderner Werkzeuge und Methoden aktiv voran, insbesondere die KI-gestützte Softwareentwicklung, die CDS-Views als moderne Auswertungsschicht direkt in S/4HANA und die Themen rund um die S/4HANA-Migration.</w:t>
+      </w:r>
+    </w:p>
+    <w:p>
+      <w:pPr>
+        <w:pStyle w:val="BodyText"/>
+      </w:pPr>
+      <w:r>
+        <w:rPr/>
+        <w:t xml:space="preserve">Die Reporting- und Datenlandschaft entwickle ich im Rahmen der Digitalisierungsstrategie laufend weiter und bringe neue Ansätze regelmässig in die Organisation ein.</w:t>
+      </w:r>
+    </w:p>
+    <w:p>
+      <w:pPr>
+        <w:pStyle w:val="BodyText"/>
+        <w:pBdr>
+          <w:left w:val="single" w:color="B4C6E7" w:sz="12" w:space="8"/>
+        </w:pBdr>
+        <w:spacing w:before="60" w:after="200" w:line="288" w:lineRule="auto"/>
+        <w:ind w:left="220"/>
+      </w:pPr>
+      <w:r>
+        <w:rPr>
+          <w:i/>
+          <w:color w:val="365F91"/>
+        </w:rPr>
+        <w:t xml:space="preserve">Kein eigenes Arbeitspaket. Dieses Gebiet wirkt in alle übrigen vier hinein.</w:t>
+      </w:r>
+    </w:p>
+    <w:p>
+      <w:pPr>
+        <w:pStyle w:val="Heading1"/>
+      </w:pPr>
+      <w:r>
+        <w:rPr/>
+        <w:t xml:space="preserve">3. Was in meiner Verantwortung liegt und was nicht</w:t>
       </w:r>
     </w:p>
     <w:p>
@@ -542,7 +811,7 @@
       </w:pPr>
       <w:r>
         <w:rPr/>
-        <w:t xml:space="preserve">2.1 In meiner Verantwortung</w:t>
+        <w:t xml:space="preserve">3.1 In meiner Verantwortung</w:t>
       </w:r>
     </w:p>
     <w:tbl>
@@ -634,7 +903,7 @@
               <w:rPr>
                 <w:b/>
               </w:rPr>
-              <w:t xml:space="preserve">Verkaufsdaten der Gruppe</w:t>
+              <w:t xml:space="preserve">ABAP-Entwicklung in S/4HANA</w:t>
             </w:r>
           </w:p>
         </w:tc>
@@ -655,7 +924,7 @@
             </w:pPr>
             <w:r>
               <w:rPr/>
-              <w:t xml:space="preserve">Abzug, Vereinheitlichung und Zusammenführung der ERP-Daten aller Tochtergesellschaften in eine gemeinsame Auswertungsbasis</w:t>
+              <w:t xml:space="preserve">Eigenständige Konzeption, Entwicklung und Wartung der kundeneigenen Programme und Schnittstellen in Logistik, Vertrieb, Variantenkonfiguration, Ursprungsland und Zoll sowie Preisfindung</w:t>
             </w:r>
           </w:p>
         </w:tc>
@@ -680,7 +949,7 @@
               <w:rPr>
                 <w:b/>
               </w:rPr>
-              <w:t xml:space="preserve">Finanz- und Verkaufsreporting</w:t>
+              <w:t xml:space="preserve">Data-Warehouse-Architektur</w:t>
             </w:r>
           </w:p>
         </w:tc>
@@ -701,7 +970,7 @@
             </w:pPr>
             <w:r>
               <w:rPr/>
-              <w:t xml:space="preserve">Harmonisierung der Kennzahlen, Umsatz, Marge, Standardkosten, Nachvollziehbarkeit und Nachweisführung</w:t>
+              <w:t xml:space="preserve">Aufbau und Betrieb der zentralen Datenplattform samt der SAP-seitigen Extraktoren und Exportprogramme</w:t>
             </w:r>
           </w:p>
         </w:tc>
@@ -726,7 +995,7 @@
               <w:rPr>
                 <w:b/>
               </w:rPr>
-              <w:t xml:space="preserve">Personalauswertung</w:t>
+              <w:t xml:space="preserve">Verkaufsdaten der Gruppe</w:t>
             </w:r>
           </w:p>
         </w:tc>
@@ -747,7 +1016,7 @@
             </w:pPr>
             <w:r>
               <w:rPr/>
-              <w:t xml:space="preserve">Auswertung und Darstellung der Personaldaten, Fluktuation und Absenzen; getrennte Zugriffsrechte</w:t>
+              <w:t xml:space="preserve">Abzug, Vereinheitlichung und Zusammenführung der ERP-Daten aller Tochtergesellschaften in eine gemeinsame Auswertungsbasis</w:t>
             </w:r>
           </w:p>
         </w:tc>
@@ -772,7 +1041,7 @@
               <w:rPr>
                 <w:b/>
               </w:rPr>
-              <w:t xml:space="preserve">Einkaufsauswertung</w:t>
+              <w:t xml:space="preserve">Finanz- und Verkaufsreporting</w:t>
             </w:r>
           </w:p>
         </w:tc>
@@ -793,7 +1062,7 @@
             </w:pPr>
             <w:r>
               <w:rPr/>
-              <w:t xml:space="preserve">Einkaufsvolumen je Lieferant und Jahr, offene Bestellungen, Disposition, Produkt- und Warengruppen</w:t>
+              <w:t xml:space="preserve">Harmonisierung der Kennzahlen, Umsatz, Marge, Standardkosten, Nachvollziehbarkeit und Nachweisführung</w:t>
             </w:r>
           </w:p>
         </w:tc>
@@ -818,7 +1087,7 @@
               <w:rPr>
                 <w:b/>
               </w:rPr>
-              <w:t xml:space="preserve">Auswertungsplattform</w:t>
+              <w:t xml:space="preserve">Personalauswertung</w:t>
             </w:r>
           </w:p>
         </w:tc>
@@ -839,7 +1108,7 @@
             </w:pPr>
             <w:r>
               <w:rPr/>
-              <w:t xml:space="preserve">Betrieb, Weiterentwicklung, Bereitstellung auf dem Server und Datenqualität</w:t>
+              <w:t xml:space="preserve">Auswertung und Darstellung der Personaldaten, Fluktuation und Absenzen; getrennte Zugriffsrechte</w:t>
             </w:r>
           </w:p>
         </w:tc>
@@ -864,7 +1133,7 @@
               <w:rPr>
                 <w:b/>
               </w:rPr>
-              <w:t xml:space="preserve">SAP-Auswertungsprogramme</w:t>
+              <w:t xml:space="preserve">Einkaufsauswertung</w:t>
             </w:r>
           </w:p>
         </w:tc>
@@ -885,7 +1154,99 @@
             </w:pPr>
             <w:r>
               <w:rPr/>
-              <w:t xml:space="preserve">Pflege der Auswertungs- und Z-Programme, soweit sie für Reporting oder die Webseite gebraucht werden</w:t>
+              <w:t xml:space="preserve">Einkaufsvolumen je Lieferant und Jahr, offene Bestellungen, Disposition, Produkt- und Warengruppen</w:t>
+            </w:r>
+          </w:p>
+        </w:tc>
+      </w:tr>
+      <w:tr>
+        <w:tc>
+          <w:tcPr>
+            <w:tcW w:w="1700" w:type="pct"/>
+            <w:shd w:val="clear" w:fill="FFFFFF"/>
+            <w:tcMar>
+              <w:top w:w="80" w:type="dxa"/>
+              <w:left w:w="100" w:type="dxa"/>
+              <w:bottom w:w="80" w:type="dxa"/>
+              <w:right w:w="100" w:type="dxa"/>
+            </w:tcMar>
+          </w:tcPr>
+          <w:p>
+            <w:pPr>
+              <w:pStyle w:val="Meta"/>
+            </w:pPr>
+            <w:r>
+              <w:rPr>
+                <w:b/>
+              </w:rPr>
+              <w:t xml:space="preserve">Auswertungsplattform</w:t>
+            </w:r>
+          </w:p>
+        </w:tc>
+        <w:tc>
+          <w:tcPr>
+            <w:tcW w:w="3300" w:type="pct"/>
+            <w:shd w:val="clear" w:fill="FFFFFF"/>
+            <w:tcMar>
+              <w:top w:w="80" w:type="dxa"/>
+              <w:left w:w="100" w:type="dxa"/>
+              <w:bottom w:w="80" w:type="dxa"/>
+              <w:right w:w="100" w:type="dxa"/>
+            </w:tcMar>
+          </w:tcPr>
+          <w:p>
+            <w:pPr>
+              <w:pStyle w:val="Meta"/>
+            </w:pPr>
+            <w:r>
+              <w:rPr/>
+              <w:t xml:space="preserve">Betrieb, Weiterentwicklung, Bereitstellung auf dem Server und Datenqualität</w:t>
+            </w:r>
+          </w:p>
+        </w:tc>
+      </w:tr>
+      <w:tr>
+        <w:tc>
+          <w:tcPr>
+            <w:tcW w:w="1700" w:type="pct"/>
+            <w:shd w:val="clear" w:fill="F4F7FB"/>
+            <w:tcMar>
+              <w:top w:w="80" w:type="dxa"/>
+              <w:left w:w="100" w:type="dxa"/>
+              <w:bottom w:w="80" w:type="dxa"/>
+              <w:right w:w="100" w:type="dxa"/>
+            </w:tcMar>
+          </w:tcPr>
+          <w:p>
+            <w:pPr>
+              <w:pStyle w:val="Meta"/>
+            </w:pPr>
+            <w:r>
+              <w:rPr>
+                <w:b/>
+              </w:rPr>
+              <w:t xml:space="preserve">Innovation und Modernisierung</w:t>
+            </w:r>
+          </w:p>
+        </w:tc>
+        <w:tc>
+          <w:tcPr>
+            <w:tcW w:w="3300" w:type="pct"/>
+            <w:shd w:val="clear" w:fill="F4F7FB"/>
+            <w:tcMar>
+              <w:top w:w="80" w:type="dxa"/>
+              <w:left w:w="100" w:type="dxa"/>
+              <w:bottom w:w="80" w:type="dxa"/>
+              <w:right w:w="100" w:type="dxa"/>
+            </w:tcMar>
+          </w:tcPr>
+          <w:p>
+            <w:pPr>
+              <w:pStyle w:val="Meta"/>
+            </w:pPr>
+            <w:r>
+              <w:rPr/>
+              <w:t xml:space="preserve">KI-gestützte Softwareentwicklung, CDS-Views und die Weiterentwicklung der Datenlandschaft im Rahmen der Digitalisierungsstrategie</w:t>
             </w:r>
           </w:p>
         </w:tc>
@@ -903,7 +1264,7 @@
       </w:pPr>
       <w:r>
         <w:rPr/>
-        <w:t xml:space="preserve">2.2 Nicht in meiner Verantwortung</w:t>
+        <w:t xml:space="preserve">3.2 Nicht in meiner Verantwortung</w:t>
       </w:r>
     </w:p>
     <w:tbl>
@@ -995,7 +1356,7 @@
               <w:rPr>
                 <w:b/>
               </w:rPr>
-              <w:t xml:space="preserve">S/4HANA-Verträglichkeitsprüfung und die Abschaltung der Fernaufrufe, rund 30 betroffene SAP-Anwendungen</w:t>
+              <w:t xml:space="preserve">S/4HANA-Verträglichkeitsprüfung und die Abschaltung der Fernaufrufe, rund 30 betroffene SAP-Anwendungen. Die ABAP-Entwicklung selbst liegt bei mir (Abschnitt 2.1); hier geht es um das Migrationsprojekt und die Abschaltungen.</w:t>
             </w:r>
           </w:p>
         </w:tc>
@@ -1218,7 +1579,7 @@
       </w:pPr>
       <w:r>
         <w:rPr/>
-        <w:t xml:space="preserve">3. Der einzige harte Termin: 08.09.2026</w:t>
+        <w:t xml:space="preserve">4. Der einzige harte Termin: 08.09.2026</w:t>
       </w:r>
     </w:p>
     <w:p>
@@ -1624,7 +1985,7 @@
       </w:pPr>
       <w:r>
         <w:rPr/>
-        <w:t xml:space="preserve">4. Wo ich einen Entscheid oder eine Zulieferung brauche</w:t>
+        <w:t xml:space="preserve">5. Wo ich einen Entscheid oder eine Zulieferung brauche</w:t>
       </w:r>
     </w:p>
     <w:p>
@@ -2666,7 +3027,7 @@
       </w:pPr>
       <w:r>
         <w:rPr/>
-        <w:t xml:space="preserve">5. Die acht Arbeitspakete im Einzelnen</w:t>
+        <w:t xml:space="preserve">6. Die acht Arbeitspakete im Einzelnen</w:t>
       </w:r>
     </w:p>
     <w:p>
@@ -3546,7 +3907,7 @@
             </w:pPr>
             <w:r>
               <w:rPr/>
-              <w:t xml:space="preserve">Die Auswertung liefert der Fachabteilung die Grundlage, um auslaufende Materialien und Mengenkontrakte zu beurteilen. Sie hat Materialien ausgelassen und Mengen falsch dargestellt.</w:t>
+              <w:t xml:space="preserve">Diese Auswertung ist die praktische Anwendung der mehrstufigen Stücklistenauflösung aus Abschnitt 2.1. Sie liefert der Fachabteilung die Grundlage, um auslaufende Materialien und Mengenkontrakte zu beurteilen. Sie hat Materialien ausgelassen und Mengen falsch dargestellt.</w:t>
             </w:r>
           </w:p>
         </w:tc>
@@ -4821,7 +5182,7 @@
       </w:pPr>
       <w:r>
         <w:rPr/>
-        <w:t xml:space="preserve">6. Was in den nächsten sechs Monaten fertig wird</w:t>
+        <w:t xml:space="preserve">7. Was in den nächsten sechs Monaten fertig wird</w:t>
       </w:r>
     </w:p>
     <w:p>
@@ -4839,7 +5200,7 @@
       </w:pPr>
       <w:r>
         <w:rPr/>
-        <w:t xml:space="preserve">6.1 Bis Ende September 2026</w:t>
+        <w:t xml:space="preserve">7.1 Bis Ende September 2026</w:t>
       </w:r>
     </w:p>
     <w:p>
@@ -4926,7 +5287,7 @@
       </w:pPr>
       <w:r>
         <w:rPr/>
-        <w:t xml:space="preserve">6.2 Oktober bis Mitte Dezember 2026</w:t>
+        <w:t xml:space="preserve">7.2 Oktober bis Mitte Dezember 2026</w:t>
       </w:r>
     </w:p>
     <w:p>
@@ -4996,11 +5357,24 @@
     </w:p>
     <w:p>
       <w:pPr>
+        <w:pStyle w:val="BodyText"/>
+        <w:numPr>
+          <w:ilvl w:val="0"/>
+          <w:numId w:val="1"/>
+        </w:numPr>
+        <w:spacing w:after="60" w:line="288" w:lineRule="auto"/>
+      </w:pPr>
+      <w:r>
+        <w:t xml:space="preserve">Die Modernisierung weitertreiben: CDS-Views als Auswertungsschicht direkt in S/4HANA ausbauen und die KI-gestützte Entwicklung in den laufenden Betrieb überführen.</w:t>
+      </w:r>
+    </w:p>
+    <w:p>
+      <w:pPr>
         <w:pStyle w:val="Heading1"/>
       </w:pPr>
       <w:r>
         <w:rPr/>
-        <w:t xml:space="preserve">7. Datenqualität und Nachweisführung</w:t>
+        <w:t xml:space="preserve">8. Datenqualität und Nachweisführung</w:t>
       </w:r>
     </w:p>
     <w:p>
@@ -5305,7 +5679,7 @@
       </w:pPr>
       <w:r>
         <w:rPr/>
-        <w:t xml:space="preserve">8. Know-how-Risiko und Wiederanlauf</w:t>
+        <w:t xml:space="preserve">9. Know-how-Risiko und Wiederanlauf</w:t>
       </w:r>
     </w:p>
     <w:p>
@@ -5350,7 +5724,7 @@
       </w:pPr>
       <w:r>
         <w:rPr/>
-        <w:t xml:space="preserve">9. Personen, mit denen ich zusammenarbeite</w:t>
+        <w:t xml:space="preserve">10. Personen, mit denen ich zusammenarbeite</w:t>
       </w:r>
     </w:p>
     <w:p>
@@ -6126,6 +6500,73 @@
           </w:p>
         </w:tc>
       </w:tr>
+      <w:tr>
+        <w:tc>
+          <w:tcPr>
+            <w:tcW w:w="1150" w:type="pct"/>
+            <w:shd w:val="clear" w:fill="FFFFFF"/>
+            <w:tcMar>
+              <w:top w:w="80" w:type="dxa"/>
+              <w:left w:w="100" w:type="dxa"/>
+              <w:bottom w:w="80" w:type="dxa"/>
+              <w:right w:w="100" w:type="dxa"/>
+            </w:tcMar>
+          </w:tcPr>
+          <w:p>
+            <w:pPr>
+              <w:pStyle w:val="Meta"/>
+            </w:pPr>
+            <w:r>
+              <w:rPr>
+                <w:b/>
+              </w:rPr>
+              <w:t xml:space="preserve">NTT Data</w:t>
+            </w:r>
+          </w:p>
+        </w:tc>
+        <w:tc>
+          <w:tcPr>
+            <w:tcW w:w="1850" w:type="pct"/>
+            <w:shd w:val="clear" w:fill="FFFFFF"/>
+            <w:tcMar>
+              <w:top w:w="80" w:type="dxa"/>
+              <w:left w:w="100" w:type="dxa"/>
+              <w:bottom w:w="80" w:type="dxa"/>
+              <w:right w:w="100" w:type="dxa"/>
+            </w:tcMar>
+          </w:tcPr>
+          <w:p>
+            <w:pPr>
+              <w:pStyle w:val="Meta"/>
+            </w:pPr>
+            <w:r>
+              <w:rPr/>
+              <w:t xml:space="preserve">SAP, externer Partner</w:t>
+            </w:r>
+          </w:p>
+        </w:tc>
+        <w:tc>
+          <w:tcPr>
+            <w:tcW w:w="2000" w:type="pct"/>
+            <w:shd w:val="clear" w:fill="FFFFFF"/>
+            <w:tcMar>
+              <w:top w:w="80" w:type="dxa"/>
+              <w:left w:w="100" w:type="dxa"/>
+              <w:bottom w:w="80" w:type="dxa"/>
+              <w:right w:w="100" w:type="dxa"/>
+            </w:tcMar>
+          </w:tcPr>
+          <w:p>
+            <w:pPr>
+              <w:pStyle w:val="Meta"/>
+            </w:pPr>
+            <w:r>
+              <w:rPr/>
+              <w:t xml:space="preserve">Fachliche Zusammenarbeit bei der ABAP-Entwicklung im S/4HANA-Umfeld</w:t>
+            </w:r>
+          </w:p>
+        </w:tc>
+      </w:tr>
     </w:tbl>
     <w:p>
       <w:pPr>
@@ -6139,7 +6580,7 @@
       </w:pPr>
       <w:r>
         <w:rPr/>
-        <w:t xml:space="preserve">10. Vorschlag für die Zusammenarbeit</w:t>
+        <w:t xml:space="preserve">11. Vorschlag für die Zusammenarbeit</w:t>
       </w:r>
     </w:p>
     <w:p>
@@ -6161,7 +6602,7 @@
         <w:spacing w:after="60" w:line="288" w:lineRule="auto"/>
       </w:pPr>
       <w:r>
-        <w:t xml:space="preserve">Monatlich eine Fortschreibung dieses Dokuments: dieselben zehn Abschnitte, dieselben fünf Felder je Arbeitspaket, jeweils mit dem Datum der Messung.</w:t>
+        <w:t xml:space="preserve">Monatlich eine Fortschreibung dieses Dokuments: dieselben elf Abschnitte, dieselben fünf Felder je Arbeitspaket, jeweils mit dem Datum der Messung.</w:t>
       </w:r>
     </w:p>
     <w:p>
@@ -6174,7 +6615,7 @@
         <w:spacing w:after="60" w:line="288" w:lineRule="auto"/>
       </w:pPr>
       <w:r>
-        <w:t xml:space="preserve">Abschnitt 4 zuerst besprechen. Dort stehen die Punkte, die ich nicht allein abschliessen kann und bei denen eine Entscheidung oder Rückendeckung am meisten bewirkt.</w:t>
+        <w:t xml:space="preserve">Abschnitt 5 zuerst besprechen. Dort stehen die Punkte, die ich nicht allein abschliessen kann und bei denen eine Entscheidung oder Rückendeckung am meisten bewirkt.</w:t>
       </w:r>
     </w:p>
     <w:p>
@@ -6187,7 +6628,7 @@
         <w:spacing w:after="60" w:line="288" w:lineRule="auto"/>
       </w:pPr>
       <w:r>
-        <w:t xml:space="preserve">Jede zugesagte Frist wird in Abschnitt 3 sichtbar geführt, mit dem Auftraggeber und der Folge, wenn sie nicht gehalten wird.</w:t>
+        <w:t xml:space="preserve">Jede zugesagte Frist wird in Abschnitt 4 sichtbar geführt, mit dem Auftraggeber und der Folge, wenn sie nicht gehalten wird.</w:t>
       </w:r>
     </w:p>
     <w:p>
@@ -6200,12 +6641,12 @@
         <w:spacing w:after="60" w:line="288" w:lineRule="auto"/>
       </w:pPr>
       <w:r>
-        <w:t xml:space="preserve">Wenn eine Zahl im Gespräch strittig ist, weise ich den Rechenweg bis zur einzelnen Zeile nach. Dafür ist die Nachweisführung aus Abschnitt 7 gebaut.</w:t>
+        <w:t xml:space="preserve">Wenn eine Zahl im Gespräch strittig ist, weise ich den Rechenweg bis zur einzelnen Zeile nach. Dafür ist die Nachweisführung aus Abschnitt 8 gebaut.</w:t>
       </w:r>
     </w:p>
     <w:sectPr>
-      <w:headerReference xmlns:r="http://schemas.openxmlformats.org/officeDocument/2006/relationships" w:type="default" r:id="R9f54cefe4a124054"/>
-      <w:footerReference xmlns:r="http://schemas.openxmlformats.org/officeDocument/2006/relationships" w:type="default" r:id="R2d01035becbe471e"/>
+      <w:headerReference xmlns:r="http://schemas.openxmlformats.org/officeDocument/2006/relationships" w:type="default" r:id="R5d5d1b34dfda49cc"/>
+      <w:footerReference xmlns:r="http://schemas.openxmlformats.org/officeDocument/2006/relationships" w:type="default" r:id="Re0c597ecfa8b4761"/>
       <w:pgSz w:w="11906" w:h="16838"/>
       <w:pgMar w:top="1000" w:right="1100" w:bottom="1000" w:left="1100" w:header="500" w:footer="500"/>
     </w:sectPr>

</xml_diff>

<commit_message>
docs: Einkauf als eigenes Aufgabengebiet, S/4HANA-Grenze ausformuliert
Die Einkaufsauswertung wird ein eigenes Gebiet 2.4 statt eines Nebensatzes;
die Rollenbeschreibung hatte sie nicht erwaehnt, obwohl PM-04 ein eigenes
Arbeitspaket ist. Reihenfolge: ABAP, Data Warehouse, Verkauf, Einkauf,
Personal, Innovation.

Zur S/4HANA-Migration steht jetzt positiv, welcher Teil bei Ingo liegt
(kundeneigene Programme, Datenextraktion, Umstellung auf CDS-Views) und
welcher bei Lucas bleibt, statt nur einer Verneinung in der Tabelle.

PM-06 war nach dem Umbau das einzige Arbeitspaket ohne Gebiet und ist jetzt
2.1 zugeordnet. Das Werkzeug prueft neu, dass jede Paketkennung in genau
einem Gebietsverweis vorkommt; die Pruefung ist per Gegenprobe verifiziert.

Co-Authored-By: Claude Opus 5 (1M context) <noreply@anthropic.com>
Claude-Session: https://claude.ai/code/session_01FEipEUVZc9ato4KCZ6FN4R
</commit_message>
<xml_diff>
--- a/TrafagSalesExporter/docs/Uebersicht_Aufgaben_Ingo_2026-09-02.docx
+++ b/TrafagSalesExporter/docs/Uebersicht_Aufgaben_Ingo_2026-09-02.docx
@@ -70,7 +70,7 @@
         <w:spacing w:after="60" w:line="288" w:lineRule="auto"/>
       </w:pPr>
       <w:r>
-        <w:t xml:space="preserve">2. Meine fünf Aufgabengebiete</w:t>
+        <w:t xml:space="preserve">2. Meine sechs Aufgabengebiete</w:t>
       </w:r>
     </w:p>
     <w:p>
@@ -214,16 +214,16 @@
       </w:pPr>
       <w:r>
         <w:rPr/>
-        <w:t xml:space="preserve">Dazu kommen die Auswertungen für Personal und für den Einkauf sowie die Pflege der SAP-Auswertungsprogramme, soweit sie für das Reporting gebraucht werden. Der Betrieb der Auswertungsplattform, ihre Weiterentwicklung und die Sicherstellung der Datenqualität gehören ebenfalls dazu.</w:t>
-      </w:r>
-    </w:p>
-    <w:p>
-      <w:pPr>
-        <w:pStyle w:val="BodyText"/>
-      </w:pPr>
-      <w:r>
-        <w:rPr/>
-        <w:t xml:space="preserve">Der zweite Teil meiner Arbeit liegt im SAP-System selbst. Ich entwickle und pflege die kundeneigenen ABAP-Programme, mit denen Trafag Auswertungen und Abläufe abbildet, die der Standard nicht hergibt. Abschnitt 2 beschreibt diese fünf dauerhaften Aufgabengebiete im Einzelnen.</w:t>
+        <w:t xml:space="preserve">Dazu kommen die Auswertungen für den Einkauf und für das Personal. Der Betrieb der Auswertungsplattform, ihre Weiterentwicklung und die Sicherstellung der Datenqualität gehören ebenfalls dazu.</w:t>
+      </w:r>
+    </w:p>
+    <w:p>
+      <w:pPr>
+        <w:pStyle w:val="BodyText"/>
+      </w:pPr>
+      <w:r>
+        <w:rPr/>
+        <w:t xml:space="preserve">Der zweite Teil meiner Arbeit liegt im SAP-System selbst. Ich entwickle und pflege die kundeneigenen ABAP-Programme, mit denen Trafag Auswertungen und Abläufe abbildet, die der Standard nicht hergibt. Abschnitt 2 beschreibt diese sechs dauerhaften Aufgabengebiete im Einzelnen.</w:t>
       </w:r>
     </w:p>
     <w:p>
@@ -293,7 +293,7 @@
             </w:pPr>
             <w:r>
               <w:rPr/>
-              <w:t xml:space="preserve">Fünf Gebiete: ABAP-Entwicklung in S/4HANA, Data-Warehouse-Architektur, Konzernreporting, Personalkennzahlen, Innovation</w:t>
+              <w:t xml:space="preserve">Sechs Gebiete: ABAP-Entwicklung in S/4HANA, Data-Warehouse-Architektur, Konzernreporting, Einkaufsauswertung, Personalkennzahlen, Innovation</w:t>
             </w:r>
           </w:p>
         </w:tc>
@@ -546,16 +546,16 @@
       </w:pPr>
       <w:r>
         <w:rPr/>
-        <w:t xml:space="preserve">2. Meine fünf Aufgabengebiete</w:t>
-      </w:r>
-    </w:p>
-    <w:p>
-      <w:pPr>
-        <w:pStyle w:val="BodyText"/>
-      </w:pPr>
-      <w:r>
-        <w:rPr/>
-        <w:t xml:space="preserve">Diese fünf Gebiete beschreiben die Rolle und gelten dauerhaft. Sie sind nicht zu verwechseln mit dem aktuellen Stand der Arbeit, der in Abschnitt 6 steht. Damit beides zusammenfindet, nennt jedes Gebiet am Ende die Arbeitspakete, die derzeit daraus laufen.</w:t>
+        <w:t xml:space="preserve">2. Meine sechs Aufgabengebiete</w:t>
+      </w:r>
+    </w:p>
+    <w:p>
+      <w:pPr>
+        <w:pStyle w:val="BodyText"/>
+      </w:pPr>
+      <w:r>
+        <w:rPr/>
+        <w:t xml:space="preserve">Diese sechs Gebiete beschreiben die Rolle und gelten dauerhaft. Sie sind nicht zu verwechseln mit dem aktuellen Stand der Arbeit, der in Abschnitt 6 steht. Damit beides zusammenfindet, nennt jedes Gebiet am Ende die Arbeitspakete, die derzeit daraus laufen.</w:t>
       </w:r>
     </w:p>
     <w:p>
@@ -608,7 +608,7 @@
           <w:i/>
           <w:color w:val="365F91"/>
         </w:rPr>
-        <w:t xml:space="preserve">Aktuell aus diesem Gebiet in Arbeit: PM-01, PM-02 und PM-03, siehe Abschnitt 6.</w:t>
+        <w:t xml:space="preserve">Aktuell aus diesem Gebiet in Arbeit: PM-01, PM-02 und PM-03; PM-06 ist daraus abgeschlossen. Siehe Abschnitt 6.</w:t>
       </w:r>
     </w:p>
     <w:p>
@@ -652,7 +652,7 @@
           <w:i/>
           <w:color w:val="365F91"/>
         </w:rPr>
-        <w:t xml:space="preserve">Aktuell aus diesem Gebiet in Arbeit: PM-05 und PM-04, siehe Abschnitt 6.</w:t>
+        <w:t xml:space="preserve">Aktuell aus diesem Gebiet in Arbeit: PM-05, siehe Abschnitt 6.</w:t>
       </w:r>
     </w:p>
     <w:p>
@@ -705,25 +705,25 @@
       </w:pPr>
       <w:r>
         <w:rPr/>
-        <w:t xml:space="preserve">2.4 HR-Kennzahlen-Dashboard und bereichsübergreifende Projekte</w:t>
-      </w:r>
-    </w:p>
-    <w:p>
-      <w:pPr>
-        <w:pStyle w:val="BodyText"/>
-      </w:pPr>
-      <w:r>
-        <w:rPr/>
-        <w:t xml:space="preserve">In enger Zusammenarbeit mit dem Personalbereich habe ich das HR-Kennzahlen-Dashboard entwickelt, mit Datenintegration aus Rexx und SAP-HR, umgesetzt über Power Query und DAX im Corporate Design von Trafag.</w:t>
-      </w:r>
-    </w:p>
-    <w:p>
-      <w:pPr>
-        <w:pStyle w:val="BodyText"/>
-      </w:pPr>
-      <w:r>
-        <w:rPr/>
-        <w:t xml:space="preserve">Das Projekt steht beispielhaft für bereichsübergreifende Vorhaben, die ich eigenständig von der Anforderungsaufnahme bis zur Auslieferung führe.</w:t>
+        <w:t xml:space="preserve">2.4 Einkaufsauswertung</w:t>
+      </w:r>
+    </w:p>
+    <w:p>
+      <w:pPr>
+        <w:pStyle w:val="BodyText"/>
+      </w:pPr>
+      <w:r>
+        <w:rPr/>
+        <w:t xml:space="preserve">Für den Einkauf stelle ich die Kennzahlen bereit, die eine Verhandlungs- und Dispositionsgrundlage ergeben: das Einkaufsvolumen je Lieferant und Jahr, den bereits beschafften Anteil, die offenen Bestellungen samt Zulauf und die tatsächlich aktiven Lieferanten, gemessen an echten Einkaufsbewegungen statt am Stammdatenbestand.</w:t>
+      </w:r>
+    </w:p>
+    <w:p>
+      <w:pPr>
+        <w:pStyle w:val="BodyText"/>
+      </w:pPr>
+      <w:r>
+        <w:rPr/>
+        <w:t xml:space="preserve">Die zentrale Darstellung ist eine Kaskadierungstabelle mit den Lieferanten in den Zeilen und den Jahren in den Spalten, aus der sich bis zur einzelnen Bestellposition aufreissen lässt. Die Beschaffungs- und Produktgruppen kommen seit dem 12.08.2026 direkt aus zwei SAP-Diensten und nicht mehr aus einer gepflegten Excel-Liste; damit gibt es für diese Zuordnung nur noch eine Quelle.</w:t>
       </w:r>
     </w:p>
     <w:p>
@@ -740,7 +740,7 @@
           <w:i/>
           <w:color w:val="365F91"/>
         </w:rPr>
-        <w:t xml:space="preserve">Aktuell aus diesem Gebiet in Arbeit: PM-07, siehe Abschnitt 6.</w:t>
+        <w:t xml:space="preserve">Aktuell aus diesem Gebiet in Arbeit: PM-04, siehe Abschnitt 6.</w:t>
       </w:r>
     </w:p>
     <w:p>
@@ -749,25 +749,25 @@
       </w:pPr>
       <w:r>
         <w:rPr/>
-        <w:t xml:space="preserve">2.5 Innovation und Modernisierung</w:t>
-      </w:r>
-    </w:p>
-    <w:p>
-      <w:pPr>
-        <w:pStyle w:val="BodyText"/>
-      </w:pPr>
-      <w:r>
-        <w:rPr/>
-        <w:t xml:space="preserve">Ich treibe die Einführung und Nutzung moderner Werkzeuge und Methoden aktiv voran, insbesondere die KI-gestützte Softwareentwicklung, die CDS-Views als moderne Auswertungsschicht direkt in S/4HANA und die Themen rund um die S/4HANA-Migration.</w:t>
-      </w:r>
-    </w:p>
-    <w:p>
-      <w:pPr>
-        <w:pStyle w:val="BodyText"/>
-      </w:pPr>
-      <w:r>
-        <w:rPr/>
-        <w:t xml:space="preserve">Die Reporting- und Datenlandschaft entwickle ich im Rahmen der Digitalisierungsstrategie laufend weiter und bringe neue Ansätze regelmässig in die Organisation ein.</w:t>
+        <w:t xml:space="preserve">2.5 HR-Kennzahlen-Dashboard und bereichsübergreifende Projekte</w:t>
+      </w:r>
+    </w:p>
+    <w:p>
+      <w:pPr>
+        <w:pStyle w:val="BodyText"/>
+      </w:pPr>
+      <w:r>
+        <w:rPr/>
+        <w:t xml:space="preserve">In enger Zusammenarbeit mit dem Personalbereich habe ich das HR-Kennzahlen-Dashboard entwickelt, mit Datenintegration aus Rexx und SAP-HR, umgesetzt über Power Query und DAX im Corporate Design von Trafag.</w:t>
+      </w:r>
+    </w:p>
+    <w:p>
+      <w:pPr>
+        <w:pStyle w:val="BodyText"/>
+      </w:pPr>
+      <w:r>
+        <w:rPr/>
+        <w:t xml:space="preserve">Das Projekt steht beispielhaft für bereichsübergreifende Vorhaben, die ich eigenständig von der Anforderungsaufnahme bis zur Auslieferung führe.</w:t>
       </w:r>
     </w:p>
     <w:p>
@@ -784,7 +784,60 @@
           <w:i/>
           <w:color w:val="365F91"/>
         </w:rPr>
-        <w:t xml:space="preserve">Kein eigenes Arbeitspaket. Dieses Gebiet wirkt in alle übrigen vier hinein.</w:t>
+        <w:t xml:space="preserve">Aktuell aus diesem Gebiet in Arbeit: PM-07, siehe Abschnitt 6.</w:t>
+      </w:r>
+    </w:p>
+    <w:p>
+      <w:pPr>
+        <w:pStyle w:val="Heading2"/>
+      </w:pPr>
+      <w:r>
+        <w:rPr/>
+        <w:t xml:space="preserve">2.6 Innovation und Modernisierung</w:t>
+      </w:r>
+    </w:p>
+    <w:p>
+      <w:pPr>
+        <w:pStyle w:val="BodyText"/>
+      </w:pPr>
+      <w:r>
+        <w:rPr/>
+        <w:t xml:space="preserve">Ich treibe die Einführung und Nutzung moderner Werkzeuge und Methoden aktiv voran, insbesondere die KI-gestützte Softwareentwicklung, die CDS-Views als moderne Auswertungsschicht direkt in S/4HANA und die Themen rund um die S/4HANA-Migration.</w:t>
+      </w:r>
+    </w:p>
+    <w:p>
+      <w:pPr>
+        <w:pStyle w:val="BodyText"/>
+      </w:pPr>
+      <w:r>
+        <w:rPr/>
+        <w:t xml:space="preserve">Bei der Migration liegt der Teil bei mir, der die Auswertungen betrifft: die kundeneigenen Programme, die Datenextraktion und die Frage, welche Auswertung künftig als CDS-View statt als eigenes Programm läuft. Das Migrationsprojekt selbst und die Abschaltung der Fernaufrufe liegen bei Lucas, siehe Abschnitt 3.2.</w:t>
+      </w:r>
+    </w:p>
+    <w:p>
+      <w:pPr>
+        <w:pStyle w:val="BodyText"/>
+      </w:pPr>
+      <w:r>
+        <w:rPr/>
+        <w:t xml:space="preserve">Die Reporting- und Datenlandschaft entwickle ich im Rahmen der Digitalisierungsstrategie laufend weiter und bringe neue Ansätze regelmässig in die Organisation ein.</w:t>
+      </w:r>
+    </w:p>
+    <w:p>
+      <w:pPr>
+        <w:pStyle w:val="BodyText"/>
+        <w:pBdr>
+          <w:left w:val="single" w:color="B4C6E7" w:sz="12" w:space="8"/>
+        </w:pBdr>
+        <w:spacing w:before="60" w:after="200" w:line="288" w:lineRule="auto"/>
+        <w:ind w:left="220"/>
+      </w:pPr>
+      <w:r>
+        <w:rPr>
+          <w:i/>
+          <w:color w:val="365F91"/>
+        </w:rPr>
+        <w:t xml:space="preserve">Kein eigenes Arbeitspaket. Dieses Gebiet wirkt in alle übrigen fünf hinein.</w:t>
       </w:r>
     </w:p>
     <w:p>
@@ -6645,8 +6698,8 @@
       </w:r>
     </w:p>
     <w:sectPr>
-      <w:headerReference xmlns:r="http://schemas.openxmlformats.org/officeDocument/2006/relationships" w:type="default" r:id="R5d5d1b34dfda49cc"/>
-      <w:footerReference xmlns:r="http://schemas.openxmlformats.org/officeDocument/2006/relationships" w:type="default" r:id="Re0c597ecfa8b4761"/>
+      <w:headerReference xmlns:r="http://schemas.openxmlformats.org/officeDocument/2006/relationships" w:type="default" r:id="R9a0755d488d74b40"/>
+      <w:footerReference xmlns:r="http://schemas.openxmlformats.org/officeDocument/2006/relationships" w:type="default" r:id="Rdd1648409d154aa3"/>
       <w:pgSz w:w="11906" w:h="16838"/>
       <w:pgMar w:top="1000" w:right="1100" w:bottom="1000" w:left="1100" w:header="500" w:footer="500"/>
     </w:sectPr>

</xml_diff>